<commit_message>
adding comments to the document
</commit_message>
<xml_diff>
--- a/Week_6_LabActivities/Week_6_Lab_Report.docx
+++ b/Week_6_LabActivities/Week_6_Lab_Report.docx
@@ -4,14 +4,78 @@
   <w:body>
     <w:p>
       <w:r>
+        <w:rPr>
+          <w:rStyle w:val="Heading2Char"/>
+        </w:rPr>
         <w:drawing>
-          <wp:anchor distT="0" distB="0" distL="114300" distR="114300" simplePos="0" relativeHeight="251661312" behindDoc="0" locked="0" layoutInCell="1" allowOverlap="1" wp14:anchorId="48267A29" wp14:editId="6002043B">
+          <wp:anchor distT="0" distB="0" distL="114300" distR="114300" simplePos="0" relativeHeight="251659264" behindDoc="0" locked="0" layoutInCell="1" allowOverlap="1" wp14:anchorId="4FAFE0AD" wp14:editId="0D8F530B">
             <wp:simplePos x="0" y="0"/>
             <wp:positionH relativeFrom="margin">
               <wp:align>left</wp:align>
             </wp:positionH>
             <wp:positionV relativeFrom="paragraph">
-              <wp:posOffset>2180101</wp:posOffset>
+              <wp:posOffset>636657</wp:posOffset>
+            </wp:positionV>
+            <wp:extent cx="4254719" cy="1663786"/>
+            <wp:effectExtent l="0" t="0" r="0" b="0"/>
+            <wp:wrapTopAndBottom/>
+            <wp:docPr id="1800347946" name="Picture 1"/>
+            <wp:cNvGraphicFramePr>
+              <a:graphicFrameLocks xmlns:a="http://schemas.openxmlformats.org/drawingml/2006/main" noChangeAspect="1"/>
+            </wp:cNvGraphicFramePr>
+            <a:graphic xmlns:a="http://schemas.openxmlformats.org/drawingml/2006/main">
+              <a:graphicData uri="http://schemas.openxmlformats.org/drawingml/2006/picture">
+                <pic:pic xmlns:pic="http://schemas.openxmlformats.org/drawingml/2006/picture">
+                  <pic:nvPicPr>
+                    <pic:cNvPr id="1800347946" name=""/>
+                    <pic:cNvPicPr/>
+                  </pic:nvPicPr>
+                  <pic:blipFill>
+                    <a:blip r:embed="rId4"/>
+                    <a:stretch>
+                      <a:fillRect/>
+                    </a:stretch>
+                  </pic:blipFill>
+                  <pic:spPr>
+                    <a:xfrm>
+                      <a:off x="0" y="0"/>
+                      <a:ext cx="4254719" cy="1663786"/>
+                    </a:xfrm>
+                    <a:prstGeom prst="rect">
+                      <a:avLst/>
+                    </a:prstGeom>
+                  </pic:spPr>
+                </pic:pic>
+              </a:graphicData>
+            </a:graphic>
+          </wp:anchor>
+        </w:drawing>
+      </w:r>
+      <w:r>
+        <w:rPr>
+          <w:rStyle w:val="Heading2Char"/>
+        </w:rPr>
+        <w:t>Task 1</w:t>
+      </w:r>
+      <w:r>
+        <w:t xml:space="preserve"> </w:t>
+      </w:r>
+      <w:r>
+        <w:br/>
+        <w:t>Running the code with the set amount of elements 1000</w:t>
+      </w:r>
+    </w:p>
+    <w:p/>
+    <w:p>
+      <w:r>
+        <w:drawing>
+          <wp:anchor distT="0" distB="0" distL="114300" distR="114300" simplePos="0" relativeHeight="251661312" behindDoc="0" locked="0" layoutInCell="1" allowOverlap="1" wp14:anchorId="48267A29" wp14:editId="1336D2CC">
+            <wp:simplePos x="0" y="0"/>
+            <wp:positionH relativeFrom="margin">
+              <wp:align>left</wp:align>
+            </wp:positionH>
+            <wp:positionV relativeFrom="paragraph">
+              <wp:posOffset>499110</wp:posOffset>
             </wp:positionV>
             <wp:extent cx="4311872" cy="1682836"/>
             <wp:effectExtent l="0" t="0" r="0" b="0"/>
@@ -28,7 +92,7 @@
                     <pic:cNvPicPr/>
                   </pic:nvPicPr>
                   <pic:blipFill>
-                    <a:blip r:embed="rId4"/>
+                    <a:blip r:embed="rId5"/>
                     <a:stretch>
                       <a:fillRect/>
                     </a:stretch>
@@ -49,64 +113,26 @@
         </w:drawing>
       </w:r>
       <w:r>
+        <w:t xml:space="preserve">Running the code with 10000 element, </w:t>
+      </w:r>
+      <w:r>
+        <w:br/>
+        <w:t xml:space="preserve">As you can see it is takes longer for the </w:t>
+      </w:r>
+      <w:r>
+        <w:t xml:space="preserve">Doubly linked list to be completed </w:t>
+      </w:r>
+    </w:p>
+    <w:p>
+      <w:r>
         <w:drawing>
-          <wp:anchor distT="0" distB="0" distL="114300" distR="114300" simplePos="0" relativeHeight="251659264" behindDoc="0" locked="0" layoutInCell="1" allowOverlap="1" wp14:anchorId="4FAFE0AD" wp14:editId="70D1E55F">
+          <wp:anchor distT="0" distB="0" distL="114300" distR="114300" simplePos="0" relativeHeight="251663360" behindDoc="0" locked="0" layoutInCell="1" allowOverlap="1" wp14:anchorId="6A247336" wp14:editId="3D4FD9FB">
             <wp:simplePos x="0" y="0"/>
             <wp:positionH relativeFrom="margin">
               <wp:align>left</wp:align>
             </wp:positionH>
             <wp:positionV relativeFrom="paragraph">
-              <wp:posOffset>390574</wp:posOffset>
-            </wp:positionV>
-            <wp:extent cx="4254719" cy="1663786"/>
-            <wp:effectExtent l="0" t="0" r="0" b="0"/>
-            <wp:wrapTopAndBottom/>
-            <wp:docPr id="1800347946" name="Picture 1"/>
-            <wp:cNvGraphicFramePr>
-              <a:graphicFrameLocks xmlns:a="http://schemas.openxmlformats.org/drawingml/2006/main" noChangeAspect="1"/>
-            </wp:cNvGraphicFramePr>
-            <a:graphic xmlns:a="http://schemas.openxmlformats.org/drawingml/2006/main">
-              <a:graphicData uri="http://schemas.openxmlformats.org/drawingml/2006/picture">
-                <pic:pic xmlns:pic="http://schemas.openxmlformats.org/drawingml/2006/picture">
-                  <pic:nvPicPr>
-                    <pic:cNvPr id="1800347946" name=""/>
-                    <pic:cNvPicPr/>
-                  </pic:nvPicPr>
-                  <pic:blipFill>
-                    <a:blip r:embed="rId5"/>
-                    <a:stretch>
-                      <a:fillRect/>
-                    </a:stretch>
-                  </pic:blipFill>
-                  <pic:spPr>
-                    <a:xfrm>
-                      <a:off x="0" y="0"/>
-                      <a:ext cx="4254719" cy="1663786"/>
-                    </a:xfrm>
-                    <a:prstGeom prst="rect">
-                      <a:avLst/>
-                    </a:prstGeom>
-                  </pic:spPr>
-                </pic:pic>
-              </a:graphicData>
-            </a:graphic>
-          </wp:anchor>
-        </w:drawing>
-      </w:r>
-      <w:r>
-        <w:t xml:space="preserve">Task 1 </w:t>
-      </w:r>
-    </w:p>
-    <w:p>
-      <w:r>
-        <w:drawing>
-          <wp:anchor distT="0" distB="0" distL="114300" distR="114300" simplePos="0" relativeHeight="251663360" behindDoc="0" locked="0" layoutInCell="1" allowOverlap="1" wp14:anchorId="6A247336" wp14:editId="782B021E">
-            <wp:simplePos x="0" y="0"/>
-            <wp:positionH relativeFrom="margin">
-              <wp:align>left</wp:align>
-            </wp:positionH>
-            <wp:positionV relativeFrom="paragraph">
-              <wp:posOffset>3665074</wp:posOffset>
+              <wp:posOffset>2352233</wp:posOffset>
             </wp:positionV>
             <wp:extent cx="4591286" cy="958899"/>
             <wp:effectExtent l="0" t="0" r="0" b="0"/>
@@ -144,6 +170,15 @@
         </w:drawing>
       </w:r>
       <w:r>
+        <w:br/>
+      </w:r>
+      <w:r>
+        <w:t xml:space="preserve">Running the code with 50000 elements </w:t>
+      </w:r>
+      <w:r>
+        <w:br/>
+      </w:r>
+      <w:r>
         <w:t xml:space="preserve">It was taking </w:t>
       </w:r>
       <w:proofErr w:type="spellStart"/>
@@ -152,31 +187,20 @@
       </w:r>
       <w:proofErr w:type="spellEnd"/>
       <w:r>
-        <w:t xml:space="preserve"> </w:t>
-      </w:r>
-      <w:proofErr w:type="gramStart"/>
-      <w:r>
-        <w:t>long</w:t>
-      </w:r>
-      <w:proofErr w:type="gramEnd"/>
-      <w:r>
-        <w:t xml:space="preserve"> so I killed the instance </w:t>
+        <w:t xml:space="preserve"> long so I killed the instance </w:t>
       </w:r>
     </w:p>
     <w:p/>
     <w:p>
       <w:r>
-        <w:t xml:space="preserve">B) </w:t>
-      </w:r>
-      <w:r>
         <w:drawing>
-          <wp:anchor distT="0" distB="0" distL="114300" distR="114300" simplePos="0" relativeHeight="251665408" behindDoc="0" locked="0" layoutInCell="1" allowOverlap="1" wp14:anchorId="044A1022" wp14:editId="2859A665">
+          <wp:anchor distT="0" distB="0" distL="114300" distR="114300" simplePos="0" relativeHeight="251665408" behindDoc="0" locked="0" layoutInCell="1" allowOverlap="1" wp14:anchorId="044A1022" wp14:editId="7F1A00E7">
             <wp:simplePos x="0" y="0"/>
             <wp:positionH relativeFrom="column">
-              <wp:posOffset>0</wp:posOffset>
+              <wp:posOffset>23523</wp:posOffset>
             </wp:positionH>
             <wp:positionV relativeFrom="paragraph">
-              <wp:posOffset>288290</wp:posOffset>
+              <wp:posOffset>407091</wp:posOffset>
             </wp:positionV>
             <wp:extent cx="3162463" cy="1682836"/>
             <wp:effectExtent l="0" t="0" r="0" b="0"/>
@@ -213,64 +237,24 @@
           </wp:anchor>
         </w:drawing>
       </w:r>
+      <w:r>
+        <w:t xml:space="preserve">B) </w:t>
+      </w:r>
+      <w:r>
+        <w:t xml:space="preserve"> Running the code with 1000 values </w:t>
+      </w:r>
     </w:p>
     <w:p/>
     <w:p>
       <w:r>
-        <w:lastRenderedPageBreak/>
         <w:drawing>
-          <wp:anchor distT="0" distB="0" distL="114300" distR="114300" simplePos="0" relativeHeight="251669504" behindDoc="0" locked="0" layoutInCell="1" allowOverlap="1" wp14:anchorId="201E299A" wp14:editId="42AE1502">
+          <wp:anchor distT="0" distB="0" distL="114300" distR="114300" simplePos="0" relativeHeight="251667456" behindDoc="0" locked="0" layoutInCell="1" allowOverlap="1" wp14:anchorId="5CC9FEA7" wp14:editId="10B19128">
             <wp:simplePos x="0" y="0"/>
             <wp:positionH relativeFrom="margin">
               <wp:align>left</wp:align>
             </wp:positionH>
             <wp:positionV relativeFrom="paragraph">
-              <wp:posOffset>1555115</wp:posOffset>
-            </wp:positionV>
-            <wp:extent cx="3143412" cy="1701887"/>
-            <wp:effectExtent l="0" t="0" r="0" b="0"/>
-            <wp:wrapTopAndBottom/>
-            <wp:docPr id="1529233242" name="Picture 1"/>
-            <wp:cNvGraphicFramePr>
-              <a:graphicFrameLocks xmlns:a="http://schemas.openxmlformats.org/drawingml/2006/main" noChangeAspect="1"/>
-            </wp:cNvGraphicFramePr>
-            <a:graphic xmlns:a="http://schemas.openxmlformats.org/drawingml/2006/main">
-              <a:graphicData uri="http://schemas.openxmlformats.org/drawingml/2006/picture">
-                <pic:pic xmlns:pic="http://schemas.openxmlformats.org/drawingml/2006/picture">
-                  <pic:nvPicPr>
-                    <pic:cNvPr id="1529233242" name=""/>
-                    <pic:cNvPicPr/>
-                  </pic:nvPicPr>
-                  <pic:blipFill>
-                    <a:blip r:embed="rId8"/>
-                    <a:stretch>
-                      <a:fillRect/>
-                    </a:stretch>
-                  </pic:blipFill>
-                  <pic:spPr>
-                    <a:xfrm>
-                      <a:off x="0" y="0"/>
-                      <a:ext cx="3143412" cy="1701887"/>
-                    </a:xfrm>
-                    <a:prstGeom prst="rect">
-                      <a:avLst/>
-                    </a:prstGeom>
-                  </pic:spPr>
-                </pic:pic>
-              </a:graphicData>
-            </a:graphic>
-          </wp:anchor>
-        </w:drawing>
-      </w:r>
-      <w:r>
-        <w:drawing>
-          <wp:anchor distT="0" distB="0" distL="114300" distR="114300" simplePos="0" relativeHeight="251667456" behindDoc="0" locked="0" layoutInCell="1" allowOverlap="1" wp14:anchorId="5CC9FEA7" wp14:editId="2A72B28E">
-            <wp:simplePos x="0" y="0"/>
-            <wp:positionH relativeFrom="column">
-              <wp:posOffset>255270</wp:posOffset>
-            </wp:positionH>
-            <wp:positionV relativeFrom="paragraph">
-              <wp:posOffset>0</wp:posOffset>
+              <wp:posOffset>230588</wp:posOffset>
             </wp:positionV>
             <wp:extent cx="2125980" cy="1181100"/>
             <wp:effectExtent l="0" t="0" r="7620" b="0"/>
@@ -287,7 +271,7 @@
                     <pic:cNvPicPr/>
                   </pic:nvPicPr>
                   <pic:blipFill>
-                    <a:blip r:embed="rId9"/>
+                    <a:blip r:embed="rId8"/>
                     <a:stretch>
                       <a:fillRect/>
                     </a:stretch>
@@ -313,9 +297,65 @@
           </wp:anchor>
         </w:drawing>
       </w:r>
+      <w:r>
+        <w:t xml:space="preserve">Running the code with 10000 values </w:t>
+      </w:r>
+    </w:p>
+    <w:p>
+      <w:r>
+        <w:drawing>
+          <wp:anchor distT="0" distB="0" distL="114300" distR="114300" simplePos="0" relativeHeight="251669504" behindDoc="0" locked="0" layoutInCell="1" allowOverlap="1" wp14:anchorId="201E299A" wp14:editId="73083111">
+            <wp:simplePos x="0" y="0"/>
+            <wp:positionH relativeFrom="margin">
+              <wp:align>left</wp:align>
+            </wp:positionH>
+            <wp:positionV relativeFrom="paragraph">
+              <wp:posOffset>1380683</wp:posOffset>
+            </wp:positionV>
+            <wp:extent cx="3143412" cy="1701887"/>
+            <wp:effectExtent l="0" t="0" r="0" b="0"/>
+            <wp:wrapTopAndBottom/>
+            <wp:docPr id="1529233242" name="Picture 1"/>
+            <wp:cNvGraphicFramePr>
+              <a:graphicFrameLocks xmlns:a="http://schemas.openxmlformats.org/drawingml/2006/main" noChangeAspect="1"/>
+            </wp:cNvGraphicFramePr>
+            <a:graphic xmlns:a="http://schemas.openxmlformats.org/drawingml/2006/main">
+              <a:graphicData uri="http://schemas.openxmlformats.org/drawingml/2006/picture">
+                <pic:pic xmlns:pic="http://schemas.openxmlformats.org/drawingml/2006/picture">
+                  <pic:nvPicPr>
+                    <pic:cNvPr id="1529233242" name=""/>
+                    <pic:cNvPicPr/>
+                  </pic:nvPicPr>
+                  <pic:blipFill>
+                    <a:blip r:embed="rId9"/>
+                    <a:stretch>
+                      <a:fillRect/>
+                    </a:stretch>
+                  </pic:blipFill>
+                  <pic:spPr>
+                    <a:xfrm>
+                      <a:off x="0" y="0"/>
+                      <a:ext cx="3143412" cy="1701887"/>
+                    </a:xfrm>
+                    <a:prstGeom prst="rect">
+                      <a:avLst/>
+                    </a:prstGeom>
+                  </pic:spPr>
+                </pic:pic>
+              </a:graphicData>
+            </a:graphic>
+          </wp:anchor>
+        </w:drawing>
+      </w:r>
+      <w:r>
+        <w:t>Running the code with 100000</w:t>
+      </w:r>
     </w:p>
     <w:p/>
     <w:p>
+      <w:pPr>
+        <w:pStyle w:val="Heading2"/>
+      </w:pPr>
       <w:r>
         <w:t xml:space="preserve">Task 2 </w:t>
       </w:r>
@@ -373,7 +413,10 @@
         </w:drawing>
       </w:r>
       <w:r>
-        <w:t xml:space="preserve">Insert </w:t>
+        <w:t>Insert</w:t>
+      </w:r>
+      <w:r>
+        <w:t xml:space="preserve">ing the given elements </w:t>
       </w:r>
     </w:p>
     <w:p/>
@@ -384,6 +427,7 @@
     </w:p>
     <w:p>
       <w:r>
+        <w:lastRenderedPageBreak/>
         <w:drawing>
           <wp:anchor distT="0" distB="0" distL="114300" distR="114300" simplePos="0" relativeHeight="251673600" behindDoc="0" locked="0" layoutInCell="1" allowOverlap="1" wp14:anchorId="724F3A4B" wp14:editId="6E9135A2">
             <wp:simplePos x="0" y="0"/>
@@ -498,6 +542,7 @@
     </w:p>
     <w:p>
       <w:r>
+        <w:lastRenderedPageBreak/>
         <w:drawing>
           <wp:anchor distT="0" distB="0" distL="114300" distR="114300" simplePos="0" relativeHeight="251677696" behindDoc="0" locked="0" layoutInCell="1" allowOverlap="1" wp14:anchorId="0B024FF3" wp14:editId="1FB23F44">
             <wp:simplePos x="0" y="0"/>
@@ -553,7 +598,6 @@
     <w:p/>
     <w:p>
       <w:r>
-        <w:lastRenderedPageBreak/>
         <w:drawing>
           <wp:anchor distT="0" distB="0" distL="114300" distR="114300" simplePos="0" relativeHeight="251681792" behindDoc="0" locked="0" layoutInCell="1" allowOverlap="1" wp14:anchorId="22F335EF" wp14:editId="227E4355">
             <wp:simplePos x="0" y="0"/>
@@ -784,11 +828,9 @@
         <w:lastRenderedPageBreak/>
         <w:t xml:space="preserve">The </w:t>
       </w:r>
-      <w:proofErr w:type="spellStart"/>
-      <w:r>
-        <w:t>modifyied</w:t>
-      </w:r>
-      <w:proofErr w:type="spellEnd"/>
+      <w:r>
+        <w:t>modified</w:t>
+      </w:r>
       <w:r>
         <w:t xml:space="preserve"> code </w:t>
       </w:r>
@@ -1465,7 +1507,6 @@
     <w:next w:val="Normal"/>
     <w:link w:val="Heading2Char"/>
     <w:uiPriority w:val="9"/>
-    <w:semiHidden/>
     <w:unhideWhenUsed/>
     <w:qFormat/>
     <w:rsid w:val="004610FB"/>
@@ -1702,7 +1743,6 @@
     <w:basedOn w:val="DefaultParagraphFont"/>
     <w:link w:val="Heading2"/>
     <w:uiPriority w:val="9"/>
-    <w:semiHidden/>
     <w:rsid w:val="004610FB"/>
     <w:rPr>
       <w:rFonts w:asciiTheme="majorHAnsi" w:eastAsiaTheme="majorEastAsia" w:hAnsiTheme="majorHAnsi" w:cstheme="majorBidi"/>

</xml_diff>

<commit_message>
Tidying up the word document, 28/03/2026, 7:33pm
</commit_message>
<xml_diff>
--- a/Week_6_LabActivities/Week_6_Lab_Report.docx
+++ b/Week_6_LabActivities/Week_6_Lab_Report.docx
@@ -6,6 +6,7 @@
       <w:r>
         <w:rPr>
           <w:rStyle w:val="Heading2Char"/>
+          <w:noProof/>
         </w:rPr>
         <w:drawing>
           <wp:anchor distT="0" distB="0" distL="114300" distR="114300" simplePos="0" relativeHeight="251659264" behindDoc="0" locked="0" layoutInCell="1" allowOverlap="1" wp14:anchorId="4FAFE0AD" wp14:editId="0D8F530B">
@@ -62,12 +63,23 @@
       </w:r>
       <w:r>
         <w:br/>
-        <w:t>Running the code with the set amount of elements 1000</w:t>
+        <w:t xml:space="preserve">Running the code with the set </w:t>
+      </w:r>
+      <w:proofErr w:type="gramStart"/>
+      <w:r>
+        <w:t>amount</w:t>
+      </w:r>
+      <w:proofErr w:type="gramEnd"/>
+      <w:r>
+        <w:t xml:space="preserve"> of elements 1000</w:t>
       </w:r>
     </w:p>
     <w:p/>
     <w:p>
       <w:r>
+        <w:rPr>
+          <w:noProof/>
+        </w:rPr>
         <w:drawing>
           <wp:anchor distT="0" distB="0" distL="114300" distR="114300" simplePos="0" relativeHeight="251661312" behindDoc="0" locked="0" layoutInCell="1" allowOverlap="1" wp14:anchorId="48267A29" wp14:editId="1336D2CC">
             <wp:simplePos x="0" y="0"/>
@@ -113,11 +125,27 @@
         </w:drawing>
       </w:r>
       <w:r>
-        <w:t xml:space="preserve">Running the code with 10000 element, </w:t>
+        <w:t xml:space="preserve">Running the code with 10000 </w:t>
+      </w:r>
+      <w:proofErr w:type="gramStart"/>
+      <w:r>
+        <w:t>element</w:t>
+      </w:r>
+      <w:proofErr w:type="gramEnd"/>
+      <w:r>
+        <w:t xml:space="preserve">, </w:t>
       </w:r>
       <w:r>
         <w:br/>
-        <w:t xml:space="preserve">As you can see it is takes longer for the </w:t>
+        <w:t xml:space="preserve">As you can see it </w:t>
+      </w:r>
+      <w:proofErr w:type="gramStart"/>
+      <w:r>
+        <w:t>is takes longer</w:t>
+      </w:r>
+      <w:proofErr w:type="gramEnd"/>
+      <w:r>
+        <w:t xml:space="preserve"> for the </w:t>
       </w:r>
       <w:r>
         <w:t xml:space="preserve">Doubly linked list to be completed </w:t>
@@ -125,6 +153,9 @@
     </w:p>
     <w:p>
       <w:r>
+        <w:rPr>
+          <w:noProof/>
+        </w:rPr>
         <w:drawing>
           <wp:anchor distT="0" distB="0" distL="114300" distR="114300" simplePos="0" relativeHeight="251663360" behindDoc="0" locked="0" layoutInCell="1" allowOverlap="1" wp14:anchorId="6A247336" wp14:editId="3D4FD9FB">
             <wp:simplePos x="0" y="0"/>
@@ -187,14 +218,25 @@
       </w:r>
       <w:proofErr w:type="spellEnd"/>
       <w:r>
-        <w:t xml:space="preserve"> long so I killed the instance </w:t>
+        <w:t xml:space="preserve"> </w:t>
+      </w:r>
+      <w:proofErr w:type="gramStart"/>
+      <w:r>
+        <w:t>long</w:t>
+      </w:r>
+      <w:proofErr w:type="gramEnd"/>
+      <w:r>
+        <w:t xml:space="preserve"> so I killed the instance </w:t>
       </w:r>
     </w:p>
     <w:p/>
     <w:p>
       <w:r>
+        <w:rPr>
+          <w:noProof/>
+        </w:rPr>
         <w:drawing>
-          <wp:anchor distT="0" distB="0" distL="114300" distR="114300" simplePos="0" relativeHeight="251665408" behindDoc="0" locked="0" layoutInCell="1" allowOverlap="1" wp14:anchorId="044A1022" wp14:editId="7F1A00E7">
+          <wp:anchor distT="0" distB="0" distL="114300" distR="114300" simplePos="0" relativeHeight="251665408" behindDoc="0" locked="0" layoutInCell="1" allowOverlap="1" wp14:anchorId="044A1022" wp14:editId="3A04BC9B">
             <wp:simplePos x="0" y="0"/>
             <wp:positionH relativeFrom="column">
               <wp:posOffset>23523</wp:posOffset>
@@ -247,6 +289,9 @@
     <w:p/>
     <w:p>
       <w:r>
+        <w:rPr>
+          <w:noProof/>
+        </w:rPr>
         <w:drawing>
           <wp:anchor distT="0" distB="0" distL="114300" distR="114300" simplePos="0" relativeHeight="251667456" behindDoc="0" locked="0" layoutInCell="1" allowOverlap="1" wp14:anchorId="5CC9FEA7" wp14:editId="10B19128">
             <wp:simplePos x="0" y="0"/>
@@ -303,6 +348,9 @@
     </w:p>
     <w:p>
       <w:r>
+        <w:rPr>
+          <w:noProof/>
+        </w:rPr>
         <w:drawing>
           <wp:anchor distT="0" distB="0" distL="114300" distR="114300" simplePos="0" relativeHeight="251669504" behindDoc="0" locked="0" layoutInCell="1" allowOverlap="1" wp14:anchorId="201E299A" wp14:editId="73083111">
             <wp:simplePos x="0" y="0"/>
@@ -362,6 +410,9 @@
     </w:p>
     <w:p>
       <w:r>
+        <w:rPr>
+          <w:noProof/>
+        </w:rPr>
         <w:drawing>
           <wp:anchor distT="0" distB="0" distL="114300" distR="114300" simplePos="0" relativeHeight="251671552" behindDoc="0" locked="0" layoutInCell="1" allowOverlap="1" wp14:anchorId="094B64B5" wp14:editId="0D434D40">
             <wp:simplePos x="0" y="0"/>
@@ -422,20 +473,17 @@
     <w:p/>
     <w:p>
       <w:r>
-        <w:t xml:space="preserve">Search </w:t>
-      </w:r>
-    </w:p>
-    <w:p>
-      <w:r>
-        <w:lastRenderedPageBreak/>
+        <w:rPr>
+          <w:noProof/>
+        </w:rPr>
         <w:drawing>
-          <wp:anchor distT="0" distB="0" distL="114300" distR="114300" simplePos="0" relativeHeight="251673600" behindDoc="0" locked="0" layoutInCell="1" allowOverlap="1" wp14:anchorId="724F3A4B" wp14:editId="6E9135A2">
+          <wp:anchor distT="0" distB="0" distL="114300" distR="114300" simplePos="0" relativeHeight="251673600" behindDoc="0" locked="0" layoutInCell="1" allowOverlap="1" wp14:anchorId="724F3A4B" wp14:editId="67B2E344">
             <wp:simplePos x="0" y="0"/>
             <wp:positionH relativeFrom="margin">
-              <wp:posOffset>342900</wp:posOffset>
+              <wp:posOffset>781050</wp:posOffset>
             </wp:positionH>
             <wp:positionV relativeFrom="paragraph">
-              <wp:posOffset>212090</wp:posOffset>
+              <wp:posOffset>372745</wp:posOffset>
             </wp:positionV>
             <wp:extent cx="3276600" cy="1729105"/>
             <wp:effectExtent l="0" t="0" r="0" b="4445"/>
@@ -478,16 +526,27 @@
           </wp:anchor>
         </w:drawing>
       </w:r>
-    </w:p>
-    <w:p/>
-    <w:p/>
-    <w:p>
-      <w:r>
-        <w:t xml:space="preserve">Delete </w:t>
-      </w:r>
-    </w:p>
-    <w:p>
-      <w:r>
+      <w:r>
+        <w:t>Search</w:t>
+      </w:r>
+      <w:r>
+        <w:t xml:space="preserve">ing for value 10 in the double linked list </w:t>
+      </w:r>
+    </w:p>
+    <w:p>
+      <w:r>
+        <w:lastRenderedPageBreak/>
+        <w:t>Delet</w:t>
+      </w:r>
+      <w:r>
+        <w:t xml:space="preserve">ing element 50 from the double linked list </w:t>
+      </w:r>
+    </w:p>
+    <w:p>
+      <w:r>
+        <w:rPr>
+          <w:noProof/>
+        </w:rPr>
         <w:drawing>
           <wp:anchor distT="0" distB="0" distL="114300" distR="114300" simplePos="0" relativeHeight="251675648" behindDoc="0" locked="0" layoutInCell="1" allowOverlap="1" wp14:anchorId="1F06E4EF" wp14:editId="668966AF">
             <wp:simplePos x="0" y="0"/>
@@ -537,12 +596,20 @@
     <w:p/>
     <w:p>
       <w:r>
-        <w:t xml:space="preserve">Modify the code for linked lists </w:t>
-      </w:r>
-    </w:p>
-    <w:p>
-      <w:r>
-        <w:lastRenderedPageBreak/>
+        <w:t xml:space="preserve">Modifying the visualising </w:t>
+      </w:r>
+      <w:r>
+        <w:t xml:space="preserve">code for linked lists </w:t>
+      </w:r>
+      <w:r>
+        <w:br/>
+      </w:r>
+    </w:p>
+    <w:p>
+      <w:r>
+        <w:rPr>
+          <w:noProof/>
+        </w:rPr>
         <w:drawing>
           <wp:anchor distT="0" distB="0" distL="114300" distR="114300" simplePos="0" relativeHeight="251677696" behindDoc="0" locked="0" layoutInCell="1" allowOverlap="1" wp14:anchorId="0B024FF3" wp14:editId="1FB23F44">
             <wp:simplePos x="0" y="0"/>
@@ -593,19 +660,92 @@
           </wp:anchor>
         </w:drawing>
       </w:r>
+      <w:r>
+        <w:t xml:space="preserve">Inserting the elements in a single linked list </w:t>
+      </w:r>
     </w:p>
     <w:p/>
     <w:p/>
     <w:p>
       <w:r>
+        <w:t xml:space="preserve"> </w:t>
+      </w:r>
+    </w:p>
+    <w:p/>
+    <w:p>
+      <w:r>
+        <w:rPr>
+          <w:noProof/>
+        </w:rPr>
+        <w:lastRenderedPageBreak/>
         <w:drawing>
-          <wp:anchor distT="0" distB="0" distL="114300" distR="114300" simplePos="0" relativeHeight="251681792" behindDoc="0" locked="0" layoutInCell="1" allowOverlap="1" wp14:anchorId="22F335EF" wp14:editId="227E4355">
+          <wp:anchor distT="0" distB="0" distL="114300" distR="114300" simplePos="0" relativeHeight="251679744" behindDoc="0" locked="0" layoutInCell="1" allowOverlap="1" wp14:anchorId="5ED2AC64" wp14:editId="6795EC3E">
+            <wp:simplePos x="0" y="0"/>
+            <wp:positionH relativeFrom="margin">
+              <wp:align>left</wp:align>
+            </wp:positionH>
+            <wp:positionV relativeFrom="paragraph">
+              <wp:posOffset>295275</wp:posOffset>
+            </wp:positionV>
+            <wp:extent cx="4114800" cy="2086610"/>
+            <wp:effectExtent l="0" t="0" r="0" b="8890"/>
+            <wp:wrapTopAndBottom/>
+            <wp:docPr id="19669672" name="Picture 1"/>
+            <wp:cNvGraphicFramePr>
+              <a:graphicFrameLocks xmlns:a="http://schemas.openxmlformats.org/drawingml/2006/main" noChangeAspect="1"/>
+            </wp:cNvGraphicFramePr>
+            <a:graphic xmlns:a="http://schemas.openxmlformats.org/drawingml/2006/main">
+              <a:graphicData uri="http://schemas.openxmlformats.org/drawingml/2006/picture">
+                <pic:pic xmlns:pic="http://schemas.openxmlformats.org/drawingml/2006/picture">
+                  <pic:nvPicPr>
+                    <pic:cNvPr id="19669672" name=""/>
+                    <pic:cNvPicPr/>
+                  </pic:nvPicPr>
+                  <pic:blipFill>
+                    <a:blip r:embed="rId14"/>
+                    <a:stretch>
+                      <a:fillRect/>
+                    </a:stretch>
+                  </pic:blipFill>
+                  <pic:spPr>
+                    <a:xfrm>
+                      <a:off x="0" y="0"/>
+                      <a:ext cx="4114800" cy="2086610"/>
+                    </a:xfrm>
+                    <a:prstGeom prst="rect">
+                      <a:avLst/>
+                    </a:prstGeom>
+                  </pic:spPr>
+                </pic:pic>
+              </a:graphicData>
+            </a:graphic>
+            <wp14:sizeRelH relativeFrom="margin">
+              <wp14:pctWidth>0</wp14:pctWidth>
+            </wp14:sizeRelH>
+            <wp14:sizeRelV relativeFrom="margin">
+              <wp14:pctHeight>0</wp14:pctHeight>
+            </wp14:sizeRelV>
+          </wp:anchor>
+        </w:drawing>
+      </w:r>
+      <w:r>
+        <w:t xml:space="preserve">Searching for element 50 in the single linked list </w:t>
+      </w:r>
+    </w:p>
+    <w:p/>
+    <w:p>
+      <w:r>
+        <w:rPr>
+          <w:noProof/>
+        </w:rPr>
+        <w:drawing>
+          <wp:anchor distT="0" distB="0" distL="114300" distR="114300" simplePos="0" relativeHeight="251681792" behindDoc="0" locked="0" layoutInCell="1" allowOverlap="1" wp14:anchorId="22F335EF" wp14:editId="20ED8C2F">
             <wp:simplePos x="0" y="0"/>
             <wp:positionH relativeFrom="column">
               <wp:posOffset>-12700</wp:posOffset>
             </wp:positionH>
             <wp:positionV relativeFrom="paragraph">
-              <wp:posOffset>2451100</wp:posOffset>
+              <wp:posOffset>365125</wp:posOffset>
             </wp:positionV>
             <wp:extent cx="4851400" cy="2362835"/>
             <wp:effectExtent l="0" t="0" r="6350" b="0"/>
@@ -622,7 +762,7 @@
                     <pic:cNvPicPr/>
                   </pic:nvPicPr>
                   <pic:blipFill>
-                    <a:blip r:embed="rId14"/>
+                    <a:blip r:embed="rId15"/>
                     <a:stretch>
                       <a:fillRect/>
                     </a:stretch>
@@ -649,71 +789,32 @@
         </w:drawing>
       </w:r>
       <w:r>
-        <w:t xml:space="preserve"> </w:t>
-      </w:r>
-      <w:r>
+        <w:t xml:space="preserve">Deleting the element 50 in the single linked list. </w:t>
+      </w:r>
+    </w:p>
+    <w:p/>
+    <w:p/>
+    <w:p>
+      <w:r>
+        <w:br w:type="page"/>
+      </w:r>
+    </w:p>
+    <w:p>
+      <w:pPr>
+        <w:pStyle w:val="Heading2"/>
+      </w:pPr>
+      <w:r>
+        <w:lastRenderedPageBreak/>
+        <w:t>Task 3</w:t>
+      </w:r>
+    </w:p>
+    <w:p>
+      <w:r>
+        <w:rPr>
+          <w:noProof/>
+        </w:rPr>
         <w:drawing>
-          <wp:anchor distT="0" distB="0" distL="114300" distR="114300" simplePos="0" relativeHeight="251679744" behindDoc="0" locked="0" layoutInCell="1" allowOverlap="1" wp14:anchorId="5ED2AC64" wp14:editId="4B02FBA1">
-            <wp:simplePos x="0" y="0"/>
-            <wp:positionH relativeFrom="margin">
-              <wp:align>left</wp:align>
-            </wp:positionH>
-            <wp:positionV relativeFrom="paragraph">
-              <wp:posOffset>0</wp:posOffset>
-            </wp:positionV>
-            <wp:extent cx="4114800" cy="2086610"/>
-            <wp:effectExtent l="0" t="0" r="0" b="8890"/>
-            <wp:wrapTopAndBottom/>
-            <wp:docPr id="19669672" name="Picture 1"/>
-            <wp:cNvGraphicFramePr>
-              <a:graphicFrameLocks xmlns:a="http://schemas.openxmlformats.org/drawingml/2006/main" noChangeAspect="1"/>
-            </wp:cNvGraphicFramePr>
-            <a:graphic xmlns:a="http://schemas.openxmlformats.org/drawingml/2006/main">
-              <a:graphicData uri="http://schemas.openxmlformats.org/drawingml/2006/picture">
-                <pic:pic xmlns:pic="http://schemas.openxmlformats.org/drawingml/2006/picture">
-                  <pic:nvPicPr>
-                    <pic:cNvPr id="19669672" name=""/>
-                    <pic:cNvPicPr/>
-                  </pic:nvPicPr>
-                  <pic:blipFill>
-                    <a:blip r:embed="rId15"/>
-                    <a:stretch>
-                      <a:fillRect/>
-                    </a:stretch>
-                  </pic:blipFill>
-                  <pic:spPr>
-                    <a:xfrm>
-                      <a:off x="0" y="0"/>
-                      <a:ext cx="4114800" cy="2086610"/>
-                    </a:xfrm>
-                    <a:prstGeom prst="rect">
-                      <a:avLst/>
-                    </a:prstGeom>
-                  </pic:spPr>
-                </pic:pic>
-              </a:graphicData>
-            </a:graphic>
-            <wp14:sizeRelH relativeFrom="margin">
-              <wp14:pctWidth>0</wp14:pctWidth>
-            </wp14:sizeRelH>
-            <wp14:sizeRelV relativeFrom="margin">
-              <wp14:pctHeight>0</wp14:pctHeight>
-            </wp14:sizeRelV>
-          </wp:anchor>
-        </w:drawing>
-      </w:r>
-    </w:p>
-    <w:p/>
-    <w:p>
-      <w:r>
-        <w:t>Task 3</w:t>
-      </w:r>
-    </w:p>
-    <w:p>
-      <w:r>
-        <w:lastRenderedPageBreak/>
-        <w:drawing>
-          <wp:anchor distT="0" distB="0" distL="114300" distR="114300" simplePos="0" relativeHeight="251683840" behindDoc="0" locked="0" layoutInCell="1" allowOverlap="1" wp14:anchorId="02B25B93" wp14:editId="28D9C665">
+          <wp:anchor distT="0" distB="0" distL="114300" distR="114300" simplePos="0" relativeHeight="251683840" behindDoc="0" locked="0" layoutInCell="1" allowOverlap="1" wp14:anchorId="02B25B93" wp14:editId="1C978EEB">
             <wp:simplePos x="0" y="0"/>
             <wp:positionH relativeFrom="margin">
               <wp:align>left</wp:align>
@@ -762,12 +863,19 @@
           </wp:anchor>
         </w:drawing>
       </w:r>
+      <w:r>
+        <w:t xml:space="preserve">Inserting elements into the stack </w:t>
+      </w:r>
     </w:p>
     <w:p/>
     <w:p>
       <w:r>
+        <w:rPr>
+          <w:noProof/>
+        </w:rPr>
+        <w:lastRenderedPageBreak/>
         <w:drawing>
-          <wp:anchor distT="0" distB="0" distL="114300" distR="114300" simplePos="0" relativeHeight="251685888" behindDoc="0" locked="0" layoutInCell="1" allowOverlap="1" wp14:anchorId="4FD7DD95" wp14:editId="04D6C31E">
+          <wp:anchor distT="0" distB="0" distL="114300" distR="114300" simplePos="0" relativeHeight="251685888" behindDoc="0" locked="0" layoutInCell="1" allowOverlap="1" wp14:anchorId="4FD7DD95" wp14:editId="3C8E9645">
             <wp:simplePos x="0" y="0"/>
             <wp:positionH relativeFrom="margin">
               <wp:posOffset>241300</wp:posOffset>
@@ -820,12 +928,15 @@
         <w:t xml:space="preserve">I popped 50 and then 30 </w:t>
       </w:r>
       <w:r>
+        <w:t xml:space="preserve">from the top of the stack as they were inserted in last. </w:t>
+      </w:r>
+      <w:r>
         <w:br/>
       </w:r>
     </w:p>
-    <w:p>
-      <w:r>
-        <w:lastRenderedPageBreak/>
+    <w:p/>
+    <w:p>
+      <w:r>
         <w:t xml:space="preserve">The </w:t>
       </w:r>
       <w:r>
@@ -834,22 +945,28 @@
       <w:r>
         <w:t xml:space="preserve"> code </w:t>
       </w:r>
+      <w:r>
+        <w:t xml:space="preserve">for allow and visualise the Queue </w:t>
+      </w:r>
+      <w:r>
+        <w:t xml:space="preserve">I pushed in </w:t>
+      </w:r>
     </w:p>
     <w:p>
       <w:r>
         <w:drawing>
-          <wp:anchor distT="0" distB="0" distL="114300" distR="114300" simplePos="0" relativeHeight="251687936" behindDoc="0" locked="0" layoutInCell="1" allowOverlap="1" wp14:anchorId="44B8B883" wp14:editId="50B54CB3">
+          <wp:anchor distT="0" distB="0" distL="114300" distR="114300" simplePos="0" relativeHeight="251696128" behindDoc="0" locked="0" layoutInCell="1" allowOverlap="1" wp14:anchorId="73D7ED7A" wp14:editId="3DBE4679">
             <wp:simplePos x="0" y="0"/>
-            <wp:positionH relativeFrom="margin">
-              <wp:align>left</wp:align>
+            <wp:positionH relativeFrom="column">
+              <wp:posOffset>0</wp:posOffset>
             </wp:positionH>
             <wp:positionV relativeFrom="paragraph">
-              <wp:posOffset>285750</wp:posOffset>
+              <wp:posOffset>285115</wp:posOffset>
             </wp:positionV>
-            <wp:extent cx="4699000" cy="3242945"/>
-            <wp:effectExtent l="0" t="0" r="6350" b="0"/>
+            <wp:extent cx="5639090" cy="3435527"/>
+            <wp:effectExtent l="0" t="0" r="0" b="0"/>
             <wp:wrapTopAndBottom/>
-            <wp:docPr id="952364965" name="Picture 1"/>
+            <wp:docPr id="2028599109" name="Picture 1"/>
             <wp:cNvGraphicFramePr>
               <a:graphicFrameLocks xmlns:a="http://schemas.openxmlformats.org/drawingml/2006/main" noChangeAspect="1"/>
             </wp:cNvGraphicFramePr>
@@ -857,7 +974,7 @@
               <a:graphicData uri="http://schemas.openxmlformats.org/drawingml/2006/picture">
                 <pic:pic xmlns:pic="http://schemas.openxmlformats.org/drawingml/2006/picture">
                   <pic:nvPicPr>
-                    <pic:cNvPr id="952364965" name=""/>
+                    <pic:cNvPr id="2028599109" name=""/>
                     <pic:cNvPicPr/>
                   </pic:nvPicPr>
                   <pic:blipFill>
@@ -869,7 +986,7 @@
                   <pic:spPr>
                     <a:xfrm>
                       <a:off x="0" y="0"/>
-                      <a:ext cx="4699000" cy="3242945"/>
+                      <a:ext cx="5639090" cy="3435527"/>
                     </a:xfrm>
                     <a:prstGeom prst="rect">
                       <a:avLst/>
@@ -878,41 +995,26 @@
                 </pic:pic>
               </a:graphicData>
             </a:graphic>
-            <wp14:sizeRelH relativeFrom="margin">
-              <wp14:pctWidth>0</wp14:pctWidth>
-            </wp14:sizeRelH>
-            <wp14:sizeRelV relativeFrom="margin">
-              <wp14:pctHeight>0</wp14:pctHeight>
-            </wp14:sizeRelV>
           </wp:anchor>
         </w:drawing>
       </w:r>
     </w:p>
-    <w:p/>
-    <w:p/>
-    <w:p>
-      <w:r>
-        <w:t>Got rid o</w:t>
-      </w:r>
-      <w:r>
-        <w:t xml:space="preserve">f 10 as it was in the start of the queue </w:t>
-      </w:r>
-    </w:p>
-    <w:p>
-      <w:r>
+    <w:p>
+      <w:r>
+        <w:lastRenderedPageBreak/>
         <w:drawing>
-          <wp:anchor distT="0" distB="0" distL="114300" distR="114300" simplePos="0" relativeHeight="251689984" behindDoc="0" locked="0" layoutInCell="1" allowOverlap="1" wp14:anchorId="44C0FFD9" wp14:editId="3B240E42">
+          <wp:anchor distT="0" distB="0" distL="114300" distR="114300" simplePos="0" relativeHeight="251698176" behindDoc="0" locked="0" layoutInCell="1" allowOverlap="1" wp14:anchorId="0DB7DDF0" wp14:editId="0622AFA5">
             <wp:simplePos x="0" y="0"/>
-            <wp:positionH relativeFrom="column">
-              <wp:posOffset>0</wp:posOffset>
+            <wp:positionH relativeFrom="margin">
+              <wp:align>left</wp:align>
             </wp:positionH>
             <wp:positionV relativeFrom="paragraph">
-              <wp:posOffset>279400</wp:posOffset>
+              <wp:posOffset>304165</wp:posOffset>
             </wp:positionV>
-            <wp:extent cx="4673840" cy="3759393"/>
+            <wp:extent cx="5607338" cy="3448227"/>
             <wp:effectExtent l="0" t="0" r="0" b="0"/>
             <wp:wrapTopAndBottom/>
-            <wp:docPr id="876900262" name="Picture 1"/>
+            <wp:docPr id="151255626" name="Picture 1"/>
             <wp:cNvGraphicFramePr>
               <a:graphicFrameLocks xmlns:a="http://schemas.openxmlformats.org/drawingml/2006/main" noChangeAspect="1"/>
             </wp:cNvGraphicFramePr>
@@ -920,7 +1022,7 @@
               <a:graphicData uri="http://schemas.openxmlformats.org/drawingml/2006/picture">
                 <pic:pic xmlns:pic="http://schemas.openxmlformats.org/drawingml/2006/picture">
                   <pic:nvPicPr>
-                    <pic:cNvPr id="876900262" name=""/>
+                    <pic:cNvPr id="151255626" name=""/>
                     <pic:cNvPicPr/>
                   </pic:nvPicPr>
                   <pic:blipFill>
@@ -932,7 +1034,7 @@
                   <pic:spPr>
                     <a:xfrm>
                       <a:off x="0" y="0"/>
-                      <a:ext cx="4673840" cy="3759393"/>
+                      <a:ext cx="5607338" cy="3448227"/>
                     </a:xfrm>
                     <a:prstGeom prst="rect">
                       <a:avLst/>
@@ -944,18 +1046,44 @@
           </wp:anchor>
         </w:drawing>
       </w:r>
-    </w:p>
-    <w:p>
-      <w:r>
+      <w:r>
+        <w:t>Got rid o</w:t>
+      </w:r>
+      <w:r>
+        <w:t xml:space="preserve">f 10 as it was in the start of the queue </w:t>
+      </w:r>
+    </w:p>
+    <w:p/>
+    <w:p>
+      <w:pPr>
+        <w:rPr>
+          <w:rFonts w:asciiTheme="majorHAnsi" w:eastAsiaTheme="majorEastAsia" w:hAnsiTheme="majorHAnsi" w:cstheme="majorBidi"/>
+          <w:color w:val="0F4761" w:themeColor="accent1" w:themeShade="BF"/>
+          <w:sz w:val="32"/>
+          <w:szCs w:val="32"/>
+        </w:rPr>
+      </w:pPr>
+      <w:r>
+        <w:br w:type="page"/>
+      </w:r>
+    </w:p>
+    <w:p>
+      <w:pPr>
+        <w:pStyle w:val="Heading2"/>
+      </w:pPr>
+      <w:r>
+        <w:rPr>
+          <w:noProof/>
+        </w:rPr>
         <w:lastRenderedPageBreak/>
         <w:drawing>
-          <wp:anchor distT="0" distB="0" distL="114300" distR="114300" simplePos="0" relativeHeight="251692032" behindDoc="0" locked="0" layoutInCell="1" allowOverlap="1" wp14:anchorId="2161D165" wp14:editId="2825DC34">
+          <wp:anchor distT="0" distB="0" distL="114300" distR="114300" simplePos="0" relativeHeight="251692032" behindDoc="0" locked="0" layoutInCell="1" allowOverlap="1" wp14:anchorId="2161D165" wp14:editId="41CAA254">
             <wp:simplePos x="0" y="0"/>
             <wp:positionH relativeFrom="margin">
-              <wp:align>left</wp:align>
+              <wp:posOffset>57150</wp:posOffset>
             </wp:positionH>
             <wp:positionV relativeFrom="paragraph">
-              <wp:posOffset>330200</wp:posOffset>
+              <wp:posOffset>4002405</wp:posOffset>
             </wp:positionV>
             <wp:extent cx="4279900" cy="4284980"/>
             <wp:effectExtent l="0" t="0" r="6350" b="1270"/>
@@ -1018,6 +1146,9 @@
     </w:p>
     <w:p>
       <w:r>
+        <w:rPr>
+          <w:noProof/>
+        </w:rPr>
         <w:drawing>
           <wp:anchor distT="0" distB="0" distL="114300" distR="114300" simplePos="0" relativeHeight="251694080" behindDoc="0" locked="0" layoutInCell="1" allowOverlap="1" wp14:anchorId="18B99193" wp14:editId="3E11D139">
             <wp:simplePos x="0" y="0"/>

</xml_diff>